<commit_message>
docs: replace practical 2 VS Code evidence with Terminal
</commit_message>
<xml_diff>
--- a/reports/Отчет_Практическая_работа_2_Инструменты_Девопс_Изосимов_МИ_проверено.docx
+++ b/reports/Отчет_Практическая_работа_2_Инструменты_Девопс_Изосимов_МИ_проверено.docx
@@ -280,7 +280,7 @@
         <w:jc w:val="both"/>
       </w:pPr>
       <w:r>
-        <w:t>Освоить создание и использование веток, выполнить работу по GitHub Flow, подготовить Pull Request, изучить средства Git в VS Code и письменно сравнить Git с SVN.</w:t>
+        <w:t>Освоить создание и использование веток, выполнить работу по GitHub Flow, подготовить Pull Request, проверить ветки и изменения средствами Git в Terminal и письменно сравнить Git с SVN.</w:t>
       </w:r>
     </w:p>
     <w:p>
@@ -560,14 +560,8 @@
               <w:spacing w:after="0"/>
               <w:jc w:val="left"/>
             </w:pPr>
-            <w:r/>
             <w:r>
-              <w:rPr>
-                <w:rFonts w:ascii="Times New Roman" w:hAnsi="Times New Roman"/>
-                <w:b w:val="0"/>
-                <w:sz w:val="21"/>
-              </w:rPr>
-              <w:t>Diff в VS Code, GitLens, файл ide_notes.md и коммит в main через терминал</w:t>
+              <w:t>Ветки, граф истории и diff проверены в Terminal; файл ide_notes.md и коммит в main</w:t>
             </w:r>
           </w:p>
         </w:tc>
@@ -846,11 +840,7 @@
         <w:jc w:val="center"/>
       </w:pPr>
       <w:r>
-        <w:rPr>
-          <w:i/>
-          <w:sz w:val="20"/>
-        </w:rPr>
-        <w:t>Рисунок 1 - Ветка feature/hobby-project и граф истории коммитов</w:t>
+        <w:t>Рисунок 1 - Ветки и граф истории коммитов в Terminal</w:t>
       </w:r>
     </w:p>
     <w:p>
@@ -959,7 +949,7 @@
         <w:pStyle w:val="Heading1"/>
       </w:pPr>
       <w:r>
-        <w:t>Задание 3 Git в VS Code</w:t>
+        <w:t>Задание 3 Работа с Git в Terminal</w:t>
       </w:r>
     </w:p>
     <w:p>
@@ -967,7 +957,7 @@
         <w:jc w:val="both"/>
       </w:pPr>
       <w:r>
-        <w:t>Репозиторий открыт в VS Code. В панели Source Control просмотрены история коммитов и diff файла hobby.md. Установлен GitLens. Изменение критерия готовности в hobby.md было подготовлено через интерфейс редактора.</w:t>
+        <w:t>В Terminal просмотрены локальные и удалённые ветки, граф истории коммитов и diff файла hobby.md между ветками main и feature/hobby-project. Проверка выполнена командами git branch -a, git log --oneline --all --graph --decorate и git diff.</w:t>
       </w:r>
     </w:p>
     <w:p>
@@ -1016,11 +1006,7 @@
         <w:jc w:val="center"/>
       </w:pPr>
       <w:r>
-        <w:rPr>
-          <w:i/>
-          <w:sz w:val="20"/>
-        </w:rPr>
-        <w:t>Рисунок 3 - Панель Source Control и открытый diff файла hobby.md</w:t>
+        <w:t>Рисунок 3 - Просмотр изменений hobby.md командой git diff в Terminal</w:t>
       </w:r>
     </w:p>
     <w:p>
@@ -1028,7 +1014,7 @@
         <w:jc w:val="both"/>
       </w:pPr>
       <w:r>
-        <w:t>В файле ide_notes.md записаны три удобные возможности VS Code: единая панель для изменений и коммита, наглядный diff и граф истории с аннотациями GitLens. Для терминала отмечен интерактивный rebase. Исправленная версия файла зафиксирована коммитом 019622f с сообщением docs: add IDE vs CLI notes и отправлена в main через терминал.</w:t>
+        <w:t>В файле ide_notes.md сохранено сравнение работы с Git через графический интерфейс и командную строку. В Terminal проверены ветки, граф истории, различия между ветками и интерактивный rebase. Файл зафиксирован коммитом 019622f с сообщением docs: add IDE vs CLI notes и отправлен в main.</w:t>
       </w:r>
     </w:p>
     <w:p>
@@ -1165,7 +1151,7 @@
         <w:jc w:val="both"/>
       </w:pPr>
       <w:r>
-        <w:t>Индивидуальная часть практической работы выполнена: создана feature-ветка, подготовлен Pull Request, изучен Git в VS Code, опубликован файл ide_notes.md и оформлены ответы по SVN. Подготовительная работа с интерактивным rebase выполнена локально. Для полного завершения практической работы требуется независимый комментарий в PR №7, исправление по замечанию, одобрение, Squash and merge и удаление feature-ветки.</w:t>
+        <w:t>Индивидуальная часть практической работы выполнена: создана feature-ветка, подготовлен Pull Request, работа с ветками и diff проверена в Terminal, опубликован файл ide_notes.md и оформлены ответы по SVN. Подготовительная работа с интерактивным rebase выполнена локально. Для полного завершения практической работы требуется независимый комментарий в PR №7, исправление по замечанию, одобрение, Squash and merge и удаление feature-ветки.</w:t>
       </w:r>
     </w:p>
     <w:p>

</xml_diff>